<commit_message>
Remove pandoc's docx artefacts before submission
Pandoc writes a bookmark for every heading, as anchors for a table of
contents it never generates. Word draws bookmarks as grey square brackets
when 'Show bookmarks' is on, so every heading appeared wrapped in [ ].
Pandoc also stamps the file as Word 12 (2007), which makes modern Word open
it in Compatibility Mode.

scripts/polish_docx.py strips the bookmarks, restamps the file as Word 16
and declares compatibility mode 15. It refuses to run on a file Word
currently has open, since the next save in Word would undo the fix.

Co-Authored-By: Claude Opus 5 (1M context) <noreply@anthropic.com>
</commit_message>
<xml_diff>
--- a/submission_jnm/manuscript.docx
+++ b/submission_jnm/manuscript.docx
@@ -2,7 +2,6 @@
 <file path=word/document.xml><?xml version="1.0" encoding="utf-8"?>
 <w:document xmlns:w="http://schemas.openxmlformats.org/wordprocessingml/2006/main" xmlns:m="http://schemas.openxmlformats.org/officeDocument/2006/math" xmlns:r="http://schemas.openxmlformats.org/officeDocument/2006/relationships" xmlns:o="urn:schemas-microsoft-com:office:office" xmlns:v="urn:schemas-microsoft-com:vml" xmlns:w10="urn:schemas-microsoft-com:office:word" xmlns:a="http://schemas.openxmlformats.org/drawingml/2006/main" xmlns:pic="http://schemas.openxmlformats.org/drawingml/2006/picture" xmlns:wp="http://schemas.openxmlformats.org/drawingml/2006/wordprocessingDrawing">
   <w:body>
-    <w:bookmarkStart w:id="41" w:name="X18427ef6064728162a6624e83529bab00080426"/>
     <w:p>
       <w:pPr>
         <w:pStyle w:val="Heading1"/>
@@ -65,7 +64,6 @@
         </w:pict>
       </w:r>
     </w:p>
-    <w:bookmarkStart w:id="9" w:name="abstract"/>
     <w:p>
       <w:pPr>
         <w:pStyle w:val="Heading2"/>
@@ -189,8 +187,6 @@
         </w:pict>
       </w:r>
     </w:p>
-    <w:bookmarkEnd w:id="9"/>
-    <w:bookmarkStart w:id="10" w:name="introduction"/>
     <w:p>
       <w:pPr>
         <w:pStyle w:val="Heading2"/>
@@ -376,8 +372,6 @@
         </w:pict>
       </w:r>
     </w:p>
-    <w:bookmarkEnd w:id="10"/>
-    <w:bookmarkStart w:id="18" w:name="materials-and-methods"/>
     <w:p>
       <w:pPr>
         <w:pStyle w:val="Heading2"/>
@@ -386,7 +380,6 @@
         <w:t xml:space="preserve">Materials and Methods</w:t>
       </w:r>
     </w:p>
-    <w:bookmarkStart w:id="11" w:name="data"/>
     <w:p>
       <w:pPr>
         <w:pStyle w:val="Heading3"/>
@@ -461,8 +454,6 @@
         <w:t xml:space="preserve">The application also supports Human Connectome Project (HCP; Van Essen et al., 2013) multi-shell data (b = 1000/2000/3000 s/mm², 90 directions per shell) for users with HCP data access credentials, enabling demonstration of multi-tissue CSD which requires multiple non-zero b-value shells.</w:t>
       </w:r>
     </w:p>
-    <w:bookmarkEnd w:id="11"/>
-    <w:bookmarkStart w:id="12" w:name="comparison-design"/>
     <w:p>
       <w:pPr>
         <w:pStyle w:val="Heading3"/>
@@ -895,8 +886,6 @@
         </w:pict>
       </w:r>
     </w:p>
-    <w:bookmarkEnd w:id="12"/>
-    <w:bookmarkStart w:id="17" w:name="the-execution-environment"/>
     <w:p>
       <w:pPr>
         <w:pStyle w:val="Heading3"/>
@@ -913,7 +902,6 @@
         <w:t xml:space="preserve">Running three toolkits on byte-identical input is the practical obstacle to a comparison of this kind, and the reason it is rarely done. We removed it by building a single container in which all three are installed and driven from one interface, so the same data can be pushed through each without reinstallation, format conversion, or hand-managed paths. The container is what makes the comparison reproducible by others, and is released with the paper.</w:t>
       </w:r>
     </w:p>
-    <w:bookmarkStart w:id="13" w:name="container-build"/>
     <w:p>
       <w:pPr>
         <w:pStyle w:val="Heading4"/>
@@ -1095,8 +1083,6 @@
         <w:t xml:space="preserve">The first command builds the image (approximately 15 minutes, dominated by the FSL download); the second launches the container. No neuroimaging software is required on the host machine.</w:t>
       </w:r>
     </w:p>
-    <w:bookmarkEnd w:id="13"/>
-    <w:bookmarkStart w:id="14" w:name="pipeline-coverage"/>
     <w:p>
       <w:pPr>
         <w:pStyle w:val="Heading4"/>
@@ -1587,8 +1573,6 @@
         <w:t xml:space="preserve">— is demonstrated. Because the platform operates on a single subject, a synthetic group is constructed by adding Gaussian noise realisations (σ = 0.03 FA units) to the real FA map. The absence of equivalent voxelwise pipelines in MRtrix3 and DIPY (fixel-based analysis in MRtrix3 is noted as the conceptual analogue) is made explicit.</w:t>
       </w:r>
     </w:p>
-    <w:bookmarkEnd w:id="14"/>
-    <w:bookmarkStart w:id="15" w:name="reference-material"/>
     <w:p>
       <w:pPr>
         <w:pStyle w:val="Heading4"/>
@@ -1605,8 +1589,6 @@
         <w:t xml:space="preserve">A dedicated Reference section provides: (1) a DTI metrics guide with the biological interpretation of FA, MD, AD, and RD and live map display; (2) a 16-term dMRI glossary; (3) a command cheat sheet covering all seven stages across all three toolkits; and (4) a decision framework for selecting the appropriate toolkit based on acquisition type, research question, and available compute resources.</w:t>
       </w:r>
     </w:p>
-    <w:bookmarkEnd w:id="15"/>
-    <w:bookmarkStart w:id="16" w:name="availability-and-requirements"/>
     <w:p>
       <w:pPr>
         <w:pStyle w:val="Heading4"/>
@@ -1886,10 +1868,6 @@
         </w:pict>
       </w:r>
     </w:p>
-    <w:bookmarkEnd w:id="16"/>
-    <w:bookmarkEnd w:id="17"/>
-    <w:bookmarkEnd w:id="18"/>
-    <w:bookmarkStart w:id="24" w:name="results"/>
     <w:p>
       <w:pPr>
         <w:pStyle w:val="Heading2"/>
@@ -1898,7 +1876,6 @@
         <w:t xml:space="preserve">Results</w:t>
       </w:r>
     </w:p>
-    <w:bookmarkStart w:id="19" w:name="brain-mask-agreement"/>
     <w:p>
       <w:pPr>
         <w:pStyle w:val="Heading3"/>
@@ -2055,8 +2032,6 @@
         <w:t xml:space="preserve">— and the different inputs those models are designed to consume, which is part of what distinguishes them in practice. The consequence is practical rather than cosmetic: a mask that includes ventricles admits high-diffusivity, near-isotropic voxels into any subsequent group statistics. These differences are displayed in Figure 4 and annotated in the Stage 1 interface.</w:t>
       </w:r>
     </w:p>
-    <w:bookmarkEnd w:id="19"/>
-    <w:bookmarkStart w:id="20" w:name="inter-tool-dti-metric-agreement"/>
     <w:p>
       <w:pPr>
         <w:pStyle w:val="Heading3"/>
@@ -3008,8 +2983,6 @@
         <w:t xml:space="preserve">All three fits used identical input data, identical gradient tables, one shared brain mask, and one shared volume subset, so the effect must arise in the tensor fitting itself. All three were run with weighted linear least squares, but their weighting schemes, regularisation, and outlier handling differ, and those differences evidently interact with acquisition properties such as b-value, SNR, and the number of b = 0 volumes. We report this as an observation across two acquisitions. Identifying the mechanism would require a controlled comparison of the fitting routines, which is beyond the scope of this paper.</w:t>
       </w:r>
     </w:p>
-    <w:bookmarkEnd w:id="20"/>
-    <w:bookmarkStart w:id="21" w:name="non-physical-tensor-fits"/>
     <w:p>
       <w:pPr>
         <w:pStyle w:val="Heading3"/>
@@ -3386,8 +3359,6 @@
         <w:t xml:space="preserve">Two practical implications follow, and the platform makes both concrete for learners. First, agreement statistics computed on raw tensor-derived maps without a physical plausibility check can be badly misleading, and the appropriate diagnostic is to count and inspect the inadmissible voxels rather than discard them silently. Second, the number of failed tensor fits is itself a usable quality indicator that differentiates toolkits, and it is sensitive to acquisition design — particularly to the number of b = 0 volumes.</w:t>
       </w:r>
     </w:p>
-    <w:bookmarkEnd w:id="21"/>
-    <w:bookmarkStart w:id="22" w:name="shell-selection"/>
     <w:p>
       <w:pPr>
         <w:pStyle w:val="Heading3"/>
@@ -3449,8 +3420,6 @@
         <w:t xml:space="preserve">requires the user to explicitly select the shell used for fitting. For the Stanford HARDI single-shell dataset this has no practical consequence. For multi-shell data such as the HCP protocol (b = 1000/2000/3000 s/mm²), applying the single-tensor model to all shells simultaneously violates the monoexponential signal decay assumption; the resulting FA maps will differ from those obtained using only the b = 1000 shell. This is a non-trivial methodological difference that is rarely acknowledged in published methods sections and is highlighted explicitly in the dMRI Rosetta Stone Stage 4 interface.</w:t>
       </w:r>
     </w:p>
-    <w:bookmarkEnd w:id="22"/>
-    <w:bookmarkStart w:id="23" w:name="the-environment-in-practice"/>
     <w:p>
       <w:pPr>
         <w:pStyle w:val="Heading3"/>
@@ -3497,9 +3466,6 @@
         </w:pict>
       </w:r>
     </w:p>
-    <w:bookmarkEnd w:id="23"/>
-    <w:bookmarkEnd w:id="24"/>
-    <w:bookmarkStart w:id="30" w:name="discussion"/>
     <w:p>
       <w:pPr>
         <w:pStyle w:val="Heading2"/>
@@ -3508,7 +3474,6 @@
         <w:t xml:space="preserve">Discussion</w:t>
       </w:r>
     </w:p>
-    <w:bookmarkStart w:id="25" w:name="X428b10807ff91b77f33715c724f22e38d48a170"/>
     <w:p>
       <w:pPr>
         <w:pStyle w:val="Heading3"/>
@@ -3603,8 +3568,6 @@
         <w:t xml:space="preserve">The shell selection asymmetry is a second example of implementation differences that matter in practice: FSL and MRtrix3 fit all available shells by default, DIPY requires an explicit choice, and for multi-shell data this changes the resulting FA maps. Others have shown that pipeline-level choices introduce non-trivial variability in dMRI metrics (Bhagwat et al., 2021; Richie-Halford et al., 2022). What the platform adds is that such differences can be observed directly rather than only read about.</w:t>
       </w:r>
     </w:p>
-    <w:bookmarkEnd w:id="25"/>
-    <w:bookmarkStart w:id="26" w:name="comparison-with-existing-resources"/>
     <w:p>
       <w:pPr>
         <w:pStyle w:val="Heading3"/>
@@ -4236,8 +4199,6 @@
         <w:t xml:space="preserve">Brainlife.io warrants a specific note. It is a cloud-based provenance-tracking and pipeline-execution platform that supports multiple neuroimaging tools, including FSL and MRtrix3 applications (Avesani et al., 2019). Its purpose is fundamentally different from dMRI Rosetta Stone: users upload their own research data, select a pre-packaged application, and run it on cloud infrastructure to obtain results with full provenance records. Brainlife.io does not provide tutorial scaffolding, side-by-side command comparison, or the conceptual explanation layer that learners need to understand what each operation does and why. It is designed for reproducible research execution, not for cross-tool education.</w:t>
       </w:r>
     </w:p>
-    <w:bookmarkEnd w:id="26"/>
-    <w:bookmarkStart w:id="27" w:name="scalability"/>
     <w:p>
       <w:pPr>
         <w:pStyle w:val="Heading3"/>
@@ -4293,8 +4254,6 @@
         <w:t xml:space="preserve">The principal barrier to scale is not computational but distributional — the container is large, and the following section addresses that.</w:t>
       </w:r>
     </w:p>
-    <w:bookmarkEnd w:id="27"/>
-    <w:bookmarkStart w:id="28" w:name="limitations"/>
     <w:p>
       <w:pPr>
         <w:pStyle w:val="Heading3"/>
@@ -4327,8 +4286,6 @@
         <w:t xml:space="preserve">Finally, the platform has not yet been evaluated in a formal user study; a structured assessment of learning outcomes in a workshop setting would strengthen the evidence base for its educational value.</w:t>
       </w:r>
     </w:p>
-    <w:bookmarkEnd w:id="28"/>
-    <w:bookmarkStart w:id="29" w:name="future-directions"/>
     <w:p>
       <w:pPr>
         <w:pStyle w:val="Heading3"/>
@@ -4352,9 +4309,6 @@
         </w:pict>
       </w:r>
     </w:p>
-    <w:bookmarkEnd w:id="29"/>
-    <w:bookmarkEnd w:id="30"/>
-    <w:bookmarkStart w:id="31" w:name="conclusion"/>
     <w:p>
       <w:pPr>
         <w:pStyle w:val="Heading2"/>
@@ -4378,8 +4332,6 @@
         </w:pict>
       </w:r>
     </w:p>
-    <w:bookmarkEnd w:id="31"/>
-    <w:bookmarkStart w:id="32" w:name="credit-authorship-contribution-statement"/>
     <w:p>
       <w:pPr>
         <w:pStyle w:val="Heading2"/>
@@ -4413,8 +4365,6 @@
         </w:pict>
       </w:r>
     </w:p>
-    <w:bookmarkEnd w:id="32"/>
-    <w:bookmarkStart w:id="33" w:name="declaration-of-competing-interest"/>
     <w:p>
       <w:pPr>
         <w:pStyle w:val="Heading2"/>
@@ -4438,8 +4388,6 @@
         </w:pict>
       </w:r>
     </w:p>
-    <w:bookmarkEnd w:id="33"/>
-    <w:bookmarkStart w:id="34" w:name="funding"/>
     <w:p>
       <w:pPr>
         <w:pStyle w:val="Heading2"/>
@@ -4463,8 +4411,6 @@
         </w:pict>
       </w:r>
     </w:p>
-    <w:bookmarkEnd w:id="34"/>
-    <w:bookmarkStart w:id="35" w:name="X071796dd6bc546c91e96cca1cf5ff96599de61f"/>
     <w:p>
       <w:pPr>
         <w:pStyle w:val="Heading2"/>
@@ -4488,8 +4434,6 @@
         </w:pict>
       </w:r>
     </w:p>
-    <w:bookmarkEnd w:id="35"/>
-    <w:bookmarkStart w:id="36" w:name="data-availability"/>
     <w:p>
       <w:pPr>
         <w:pStyle w:val="Heading2"/>
@@ -4525,8 +4469,6 @@
         </w:pict>
       </w:r>
     </w:p>
-    <w:bookmarkEnd w:id="36"/>
-    <w:bookmarkStart w:id="37" w:name="acknowledgements"/>
     <w:p>
       <w:pPr>
         <w:pStyle w:val="Heading2"/>
@@ -4550,8 +4492,6 @@
         </w:pict>
       </w:r>
     </w:p>
-    <w:bookmarkEnd w:id="37"/>
-    <w:bookmarkStart w:id="38" w:name="references"/>
     <w:p>
       <w:pPr>
         <w:pStyle w:val="Heading2"/>
@@ -5137,8 +5077,6 @@
         </w:pict>
       </w:r>
     </w:p>
-    <w:bookmarkEnd w:id="38"/>
-    <w:bookmarkStart w:id="39" w:name="tables"/>
     <w:p>
       <w:pPr>
         <w:pStyle w:val="Heading2"/>
@@ -6885,8 +6823,6 @@
         </w:pict>
       </w:r>
     </w:p>
-    <w:bookmarkEnd w:id="39"/>
-    <w:bookmarkStart w:id="40" w:name="figure-captions"/>
     <w:p>
       <w:pPr>
         <w:pStyle w:val="Heading2"/>
@@ -7317,8 +7253,6 @@
         <w:t xml:space="preserve">As Figure 4, for the Sherbrooke 3-shell dataset.</w:t>
       </w:r>
     </w:p>
-    <w:bookmarkEnd w:id="40"/>
-    <w:bookmarkEnd w:id="41"/>
     <w:sectPr>
       <w:footerReference w:type="default" r:id="rId9"/>
       <w:footnotePr>

</xml_diff>

<commit_message>
Meet the journal's two formatting requirements
The abstract ran to 256 words against a 250-word limit, and the manuscript
carried no line numbers, which Elsevier asks for so that a referee can point at
a line rather than at a paragraph.

The abstract is now 247 words with no finding dropped: four phrases were
shortened. polish_docx.py inserts lnNumType into each section, ahead of
pgNumType and cols as Word's schema requires -- appending it instead leaves a
file Word reports as corrupt.

Co-Authored-By: Claude Opus 5 <noreply@anthropic.com>
Claude-Session: https://claude.ai/code/session_01Wud2CkZ5pwEHAeXS56jgLS
</commit_message>
<xml_diff>
--- a/submission_jnm/manuscript.docx
+++ b/submission_jnm/manuscript.docx
@@ -80,7 +80,7 @@
         <w:t xml:space="preserve"> </w:t>
       </w:r>
       <w:r>
-        <w:t xml:space="preserve">Veraart et al. (2013) showed that weighting a linear tensor fit by the measured signal biases the estimates. Weights from a predicted signal reduce this bias. Whether widely used toolkits follow this result has not been measured.</w:t>
+        <w:t xml:space="preserve">Veraart et al. (2013) showed that weighting a linear tensor fit by the measured signal biases the estimates. Weights from a predicted signal reduce this bias. Whether widely used toolkits follow it has not been measured.</w:t>
       </w:r>
     </w:p>
     <w:p>
@@ -98,7 +98,7 @@
         <w:t xml:space="preserve"> </w:t>
       </w:r>
       <w:r>
-        <w:t xml:space="preserve">We fitted tensors with FSL, MRtrix3 and DIPY on two open datasets. Every input was held identical, so the estimator rather than the toolkit varied. The weighting schemes were tested against Rician-noise phantoms and against simulations on the real gradient tables.</w:t>
+        <w:t xml:space="preserve">We fitted tensors with FSL, MRtrix3 and DIPY on two open datasets. Inputs were identical, so the estimator rather than the toolkit varied. The schemes were tested against Rician-noise phantoms and simulations on the real gradient tables.</w:t>
       </w:r>
     </w:p>
     <w:p>
@@ -161,7 +161,7 @@
         <w:t xml:space="preserve"> </w:t>
       </w:r>
       <w:r>
-        <w:t xml:space="preserve">option weights by the measured signal. In the phantom's anisotropic region, that scheme had the largest bias. At SNR 10 it underestimated FA by 0.026 and MD by 0.054 µm²/ms; the other linear fits stayed within 0.007 of truth. On real data it differed from every other estimator by 0.023–0.119 µm²/ms in MD. The toolkit defaults agreed with one another within 0.004 µm²/ms.</w:t>
+        <w:t xml:space="preserve">option weights by the measured signal. In the phantom's anisotropic region, that scheme had the largest bias. At SNR 10 it underestimated FA by 0.026 and MD by 0.054 µm²/ms; the other linear fits stayed within 0.007 of truth. On real data it differed from every other estimator by 0.023–0.119 µm²/ms in MD. The toolkit defaults agreed within 0.004 µm²/ms.</w:t>
       </w:r>
     </w:p>
     <w:p>
@@ -179,7 +179,7 @@
         <w:t xml:space="preserve"> </w:t>
       </w:r>
       <w:r>
-        <w:t xml:space="preserve">Earlier work documents variability between analysis pipelines. Here, the variability from the tensor fit is traced to one estimator, selected by a command-line flag.</w:t>
+        <w:t xml:space="preserve">Earlier work documents variability between pipelines. Here the variability from the tensor fit is traced to one estimator, set by a command-line flag.</w:t>
       </w:r>
     </w:p>
     <w:p>
@@ -14609,6 +14609,7 @@
         <w:numRestart w:val="eachSect"/>
       </w:footnotePr>
       <w:pgMar w:bottom="1417" w:left="1417" w:right="1417" w:top="1417"/>
+      <w:lnNumType w:countBy="1" w:restart="continuous" w:distance="360"/>
     </w:sectPr>
   </w:body>
 </w:document>

</xml_diff>